<commit_message>
Files updated for 2v2
</commit_message>
<xml_diff>
--- a/man/wmawk2.docx
+++ b/man/wmawk2.docx
@@ -24,25 +24,25 @@
         <w:t>.</w:t>
       </w:r>
       <w:r>
-        <w:t>1</w:t>
+        <w:t>2</w:t>
       </w:r>
       <w:r>
         <w:t xml:space="preserve">, </w:t>
       </w:r>
       <w:r>
-        <w:t>May</w:t>
+        <w:t>June</w:t>
       </w:r>
       <w:r>
         <w:t xml:space="preserve"> 2</w:t>
       </w:r>
       <w:r>
-        <w:t>4</w:t>
+        <w:t>2</w:t>
       </w:r>
       <w:r>
         <w:rPr>
           <w:vertAlign w:val="superscript"/>
         </w:rPr>
-        <w:t>th</w:t>
+        <w:t>nd</w:t>
       </w:r>
       <w:r>
         <w:t xml:space="preserve"> </w:t>
@@ -11933,6 +11933,50 @@
       <w:pPr>
         <w:pStyle w:val="BodyText"/>
       </w:pPr>
+      <w:r>
+        <w:t xml:space="preserve">Version </w:t>
+      </w:r>
+      <w:r>
+        <w:rPr>
+          <w:b/>
+          <w:bCs/>
+        </w:rPr>
+        <w:t>2.</w:t>
+      </w:r>
+      <w:r>
+        <w:rPr>
+          <w:b/>
+          <w:bCs/>
+        </w:rPr>
+        <w:t>2</w:t>
+      </w:r>
+      <w:r>
+        <w:t xml:space="preserve"> </w:t>
+      </w:r>
+      <w:r>
+        <w:t xml:space="preserve">adds %f to the list of </w:t>
+      </w:r>
+      <w:proofErr w:type="spellStart"/>
+      <w:proofErr w:type="gramStart"/>
+      <w:r>
+        <w:t>printf</w:t>
+      </w:r>
+      <w:proofErr w:type="spellEnd"/>
+      <w:r>
+        <w:t>(</w:t>
+      </w:r>
+      <w:proofErr w:type="gramEnd"/>
+      <w:r>
+        <w:t xml:space="preserve">) formats that are optimized (which gives a small speed improvement with the test programs). It also swaps to the latest version of </w:t>
+      </w:r>
+      <w:proofErr w:type="spellStart"/>
+      <w:r>
+        <w:t>ya_sprintf</w:t>
+      </w:r>
+      <w:proofErr w:type="spellEnd"/>
+      <w:r>
+        <w:t xml:space="preserve"> (2v4) which resolves an issue that can result in incorrect rounding with %f formats (giving a result potentially in error by one in the least significant digit).</w:t>
+      </w:r>
     </w:p>
     <w:sectPr>
       <w:headerReference w:type="default" r:id="rId29"/>
@@ -12096,7 +12140,7 @@
       <w:t>.</w:t>
     </w:r>
     <w:r>
-      <w:t>1</w:t>
+      <w:t>2</w:t>
     </w:r>
     <w:r>
       <w:t xml:space="preserve"> Manual</w:t>

</xml_diff>